<commit_message>
Empty-map click does nothing
Co-Authored-By: Claude Opus 5.5 <noreply@anthropic.com>
</commit_message>
<xml_diff>
--- a/Trip_Explorer_Spec.docx
+++ b/Trip_Explorer_Spec.docx
@@ -3329,7 +3329,7 @@
         <w:spacing w:after="60"/>
       </w:pPr>
       <w:r>
-        <w:t>A click on an empty spot of the map goes back to the panel’s controls: it closes the embedded browser and the search window (asking first when a saved plan with unsaved changes is shown). When the controls are already showing, it closes the panel.</w:t>
+        <w:t>A click on an empty spot of the map does nothing.</w:t>
       </w:r>
     </w:p>
     <w:p>
@@ -9362,7 +9362,7 @@
         <w:spacing w:after="60"/>
       </w:pPr>
       <w:r>
-        <w:t>Closing: Esc closes it and shows the panel again; a click on an empty spot of the map goes all the way back to the controls. Clicking another POI, trail or place label replaces the page. Opening the search window closes it.</w:t>
+        <w:t>Closing: Esc closes it and shows the panel again. Clicking another POI, trail or place label replaces the page. Opening the search window closes it.</w:t>
       </w:r>
     </w:p>
     <w:p>
@@ -10010,7 +10010,7 @@
         <w:t>Saved plans:</w:t>
       </w:r>
       <w:r>
-        <w:t xml:space="preserve"> picking one shows it in place of the temp plan, which is kept as it is. Its edits (right-click, drag, import, renaming) stay in memory until Save; the head then reads “Saved plan •”. Leaving it with unsaved edits (×, New plan, Continue current plan, another plan, an empty-map click or the screen history) asks: Save, </w:t>
+        <w:t xml:space="preserve"> picking one shows it in place of the temp plan, which is kept as it is. Its edits (right-click, drag, import, renaming) stay in memory until Save; the head then reads “Saved plan •”. Leaving it with unsaved edits (×, New plan, Continue current plan, another plan or the screen history) asks: Save, </w:t>
       </w:r>
       <w:proofErr w:type="gramStart"/>
       <w:r>

</xml_diff>

<commit_message>
Back arrow / close button in the search bar; smaller menu button bottom-left
Co-Authored-By: Claude Opus 5.5 <noreply@anthropic.com>
</commit_message>
<xml_diff>
--- a/Trip_Explorer_Spec.docx
+++ b/Trip_Explorer_Spec.docx
@@ -3303,7 +3303,7 @@
         <w:spacing w:after="60"/>
       </w:pPr>
       <w:r>
-        <w:t>The × at the top of the panel closes it; a menu button in the map’s top-left corner opens it again.</w:t>
+        <w:t>An × at the left end of the search bar closes it (shown while the panel shows its controls); a small menu button (26 px square, three 16 px stripes) in the map’s bottom-left corner opens it again.</w:t>
       </w:r>
     </w:p>
     <w:p>
@@ -3410,7 +3410,7 @@
         <w:t>Trips:</w:t>
       </w:r>
       <w:r>
-        <w:t xml:space="preserve"> the Folder… button (pick the trips folder), Refresh and ×; the trips folder’s path under them.</w:t>
+        <w:t xml:space="preserve"> the Folder… button (pick the trips folder) and Refresh; the trips folder’s path under them.</w:t>
       </w:r>
     </w:p>
     <w:p>
@@ -3538,7 +3538,7 @@
         <w:t>The search bar,</w:t>
       </w:r>
       <w:r>
-        <w:t xml:space="preserve"> at the very bottom, with the Plans menu button beside it (see Search </w:t>
+        <w:t xml:space="preserve"> at the very bottom: the × / back button on its left (see Screen history), then the input, with the Plans menu button beside it (see Search </w:t>
       </w:r>
       <w:proofErr w:type="gramStart"/>
       <w:r>
@@ -9530,7 +9530,7 @@
       </w:r>
       <w:proofErr w:type="spellEnd"/>
       <w:r>
-        <w:t xml:space="preserve"> step back and forward through them, bringing the screen back. A page also flies the map to its POI. A screen brought back this way leaves the keyboard with the map, so the keys keep walking the history.</w:t>
+        <w:t xml:space="preserve"> step back and forward through them, bringing the screen back. A page also flies the map to its POI. A screen brought back this way leaves the keyboard with the map, so the keys keep walking the history. On every screen but the controls, a back arrow (pointing left) at the left end of the search bar steps back one screen, as Alt+Left; with no earlier screen it goes back to the controls.</w:t>
       </w:r>
     </w:p>
     <w:p>

</xml_diff>

<commit_message>
Hide OSM POIs whose name is only their type ("Source" on a spring)
The type names come from OSM's translated presets (id-tagging-schema);
scripts/generic-names.mjs builds src/genericNames.json from the package.

Co-Authored-By: Claude Opus 5.5 <noreply@anthropic.com>
</commit_message>
<xml_diff>
--- a/Trip_Explorer_Spec.docx
+++ b/Trip_Explorer_Spec.docx
@@ -7313,6 +7313,29 @@
       <w:r>
         <w:t>. Every countryside chapel is tagged and they swamped the map.</w:t>
       </w:r>
+    </w:p>
+    <w:p>
+      <w:pPr>
+        <w:pStyle w:val="ListParagraph"/>
+        <w:numPr>
+          <w:ilvl w:val="0"/>
+          <w:numId w:val="2"/>
+        </w:numPr>
+        <w:spacing w:after="60"/>
+      </w:pPr>
+      <w:r>
+        <w:t>A name that is only the object's type does not count as a name, so the object is not shown: a spring named "Source" or "Πηγή" names nothing and a web search for it finds nothing. The check compares name, name:en and int_name (case, accents and spacing ignored) with the names of the object's type in every language, taken from OSM's translated preset list (the npm package @openstreetmap/id-tagging-schema, the list the iD editor uses). The object is hidden only when every name it has is such a type name ("Source Aria" is shown). scripts/generic-names.mjs builds src/genericNames.json from the package, for the types in the query above plus the catch-all types ("Historic Site"); rerun it after updating the package.</w:t>
+      </w:r>
+      <w:proofErr w:type="spellStart"/>
+      <w:proofErr w:type="spellEnd"/>
+      <w:proofErr w:type="spellStart"/>
+      <w:proofErr w:type="spellEnd"/>
+      <w:proofErr w:type="spellStart"/>
+      <w:proofErr w:type="spellEnd"/>
+      <w:proofErr w:type="spellStart"/>
+      <w:proofErr w:type="gramStart"/>
+      <w:proofErr w:type="spellEnd"/>
+      <w:proofErr w:type="gramEnd"/>
     </w:p>
     <w:p>
       <w:pPr>

</xml_diff>

<commit_message>
Spec: general recordings (both apps), POI name defaults to the date and time, camera tap-to-focus and pinch zoom, new bottom layout, Sync on Wi-Fi only
Co-Authored-By: Claude Opus 5.5 <noreply@anthropic.com>
</commit_message>
<xml_diff>
--- a/Trip_Explorer_Spec.docx
+++ b/Trip_Explorer_Spec.docx
@@ -169,7 +169,7 @@
         <w:spacing w:after="120"/>
       </w:pPr>
       <w:r>
-        <w:t>One root trips/ folder, one folder per trip, flat inside: a recordings/ folder plus one folder per POI. Plans sit in a plans/ folder inside trips/, beside the trips (see Plans). On the phone the root is /</w:t>
+        <w:t>One root trips/ folder, one folder per trip, flat inside: a recordings/ folder, a general_recordings/ folder plus one folder per POI. Plans sit in a plans/ folder inside trips/, beside the trips (see Plans). On the phone the root is /</w:t>
       </w:r>
       <w:proofErr w:type="spellStart"/>
       <w:r>
@@ -301,6 +301,36 @@
         </w:rPr>
         <w:t xml:space="preserve">       ← unfinished</w:t>
       </w:r>
+    </w:p>
+    <w:p>
+      <w:pPr>
+        <w:shd w:val="clear" w:color="auto" w:fill="F2F2F2"/>
+      </w:pPr>
+      <w:r>
+        <w:rPr>
+          <w:rFonts w:ascii="Consolas" w:eastAsia="Consolas" w:hAnsi="Consolas" w:cs="Consolas"/>
+          <w:sz w:val="19"/>
+          <w:szCs w:val="19"/>
+        </w:rPr>
+        <w:t xml:space="preserve">    ├── general_recordings/</w:t>
+      </w:r>
+      <w:proofErr w:type="spellStart"/>
+      <w:proofErr w:type="spellEnd"/>
+    </w:p>
+    <w:p>
+      <w:pPr>
+        <w:shd w:val="clear" w:color="auto" w:fill="F2F2F2"/>
+      </w:pPr>
+      <w:r>
+        <w:rPr>
+          <w:rFonts w:ascii="Consolas" w:eastAsia="Consolas" w:hAnsi="Consolas" w:cs="Consolas"/>
+          <w:sz w:val="19"/>
+          <w:szCs w:val="19"/>
+        </w:rPr>
+        <w:t xml:space="preserve">    │   └── 26.09.2026 14-05-33.opus</w:t>
+      </w:r>
+      <w:proofErr w:type="spellStart"/>
+      <w:proofErr w:type="spellEnd"/>
     </w:p>
     <w:p>
       <w:pPr>
@@ -883,6 +913,24 @@
         </w:numPr>
         <w:spacing w:after="60"/>
       </w:pPr>
+      <w:r>
+        <w:rPr/>
+        <w:t>General recording names: DD.MM.YYYY HH-MM-SS.opus, the local time the recording started (audio of the trip that belongs to no POI; see General recordings).</w:t>
+      </w:r>
+      <w:proofErr w:type="spellStart"/>
+      <w:proofErr w:type="spellEnd"/>
+      <w:proofErr w:type="spellStart"/>
+      <w:proofErr w:type="spellEnd"/>
+    </w:p>
+    <w:p>
+      <w:pPr>
+        <w:pStyle w:val="ListParagraph"/>
+        <w:numPr>
+          <w:ilvl w:val="0"/>
+          <w:numId w:val="2"/>
+        </w:numPr>
+        <w:spacing w:after="60"/>
+      </w:pPr>
       <w:proofErr w:type="gramStart"/>
       <w:r>
         <w:t xml:space="preserve">No </w:t>
@@ -1013,6 +1061,20 @@
       </w:pPr>
       <w:r>
         <w:t>Not “recordings” for a POI: that name is reserved for the recordings folder.</w:t>
+      </w:r>
+    </w:p>
+    <w:p>
+      <w:pPr>
+        <w:pStyle w:val="ListParagraph"/>
+        <w:numPr>
+          <w:ilvl w:val="0"/>
+          <w:numId w:val="2"/>
+        </w:numPr>
+        <w:spacing w:after="60"/>
+      </w:pPr>
+      <w:r>
+        <w:rPr/>
+        <w:t>Not “general_recordings” for a POI: that name is reserved for the general recordings folder.</w:t>
       </w:r>
     </w:p>
     <w:p>
@@ -2628,23 +2690,23 @@
           <w:b/>
           <w:bCs/>
         </w:rPr>
-        <w:t>Bottom row:</w:t>
-      </w:r>
-      <w:r>
-        <w:t xml:space="preserve"> the recording control, wide (Start recording; while recording, the time recorded (pauses and the gap before a resume are not counted; an auto-pause is) and the distance so far, “paused” when paused, “not moving” when auto-paused, then Pause or Resume, and Stop, all in the same height, so nothing jumps), and a small square Add POI button beside it.</w:t>
-      </w:r>
-    </w:p>
-    <w:p>
-      <w:pPr>
-        <w:pStyle w:val="ListParagraph"/>
-        <w:numPr>
-          <w:ilvl w:val="0"/>
-          <w:numId w:val="2"/>
-        </w:numPr>
-        <w:spacing w:after="60"/>
-      </w:pPr>
-      <w:r>
-        <w:t>The trip picked is remembered. With no trip yet, the name reads “No trip” and nothing forces one to be made; Start recording and Add POI then say “Create a trip first: tap the trip name → + New trip”. The New trip dialog checks the name rules and creates trips/ if needed.</w:t>
+        <w:t>Bottom section:</w:t>
+      </w:r>
+      <w:r>
+        <w:t xml:space="preserve"> two rows. Above: a square Add POI button and, taking the rest of the width, Record audio (see General recordings). Below, across the whole width: the recording control (Start recording; while recording, the time recorded (pauses and the gap before a resume are not counted; an auto-pause is) and the distance so far, “paused” when paused, “not moving” when auto-paused, then Pause or Resume, and Stop, all in the same height, so nothing jumps).</w:t>
+      </w:r>
+    </w:p>
+    <w:p>
+      <w:pPr>
+        <w:pStyle w:val="ListParagraph"/>
+        <w:numPr>
+          <w:ilvl w:val="0"/>
+          <w:numId w:val="2"/>
+        </w:numPr>
+        <w:spacing w:after="60"/>
+      </w:pPr>
+      <w:r>
+        <w:t>The trip picked is remembered. With no trip yet, the name reads “No trip” and nothing forces one to be made; Start recording, Record audio and Add POI then say “Create a trip first: tap the trip name → + New trip”. The New trip dialog checks the name rules and creates trips/ if needed.</w:t>
       </w:r>
     </w:p>
     <w:p>
@@ -2921,6 +2983,42 @@
         <w:pStyle w:val="Heading2"/>
       </w:pPr>
       <w:r>
+        <w:rPr/>
+        <w:t>General recordings</w:t>
+      </w:r>
+    </w:p>
+    <w:p>
+      <w:pPr>
+        <w:spacing w:after="120"/>
+      </w:pPr>
+      <w:r>
+        <w:rPr/>
+        <w:t>Audio of the trip that belongs to no POI. Record audio on the main screen starts one at once (the microphone permission is asked the first time); it becomes a red Stop with the running time (mm:ss), like Record note on a POI. Tap Stop to finish.</w:t>
+      </w:r>
+    </w:p>
+    <w:p>
+      <w:pPr>
+        <w:spacing w:after="120"/>
+      </w:pPr>
+      <w:r>
+        <w:rPr/>
+        <w:t>Opus at 32 kbps in an Ogg file, like audio notes, written straight to &lt;current trip&gt;/general_recordings/DD.MM.YYYY HH-MM-SS.opus (the start time). It runs in a microphone foreground service with a notification (“Recording audio”, the trip, a running timer and a Stop button), so it keeps recording with the screen off or another app open.</w:t>
+      </w:r>
+    </w:p>
+    <w:p>
+      <w:pPr>
+        <w:spacing w:after="120"/>
+      </w:pPr>
+      <w:r>
+        <w:rPr/>
+        <w:t>A long press on Record audio opens the Audio recordings screen: the trip’s general recordings, newest first, each with its length; tap one to play it (the full-screen player, swipe for the others). The one being recorded shows “recording…” and can’t be opened yet. The Back gesture returns to the main screen.</w:t>
+      </w:r>
+    </w:p>
+    <w:p>
+      <w:pPr>
+        <w:pStyle w:val="Heading2"/>
+      </w:pPr>
+      <w:r>
         <w:t>Add POI</w:t>
       </w:r>
     </w:p>
@@ -2966,20 +3064,20 @@
       </w:r>
       <w:proofErr w:type="gramEnd"/>
       <w:r>
-        <w:t>. Photos are taken one after the other, each shown as a thumbnail; Done (n) closes the camera. With no photo taken the button reads Skip; the Back gesture also closes the camera, keeping the photos.</w:t>
-      </w:r>
-    </w:p>
-    <w:p>
-      <w:pPr>
-        <w:pStyle w:val="ListParagraph"/>
-        <w:numPr>
-          <w:ilvl w:val="0"/>
-          <w:numId w:val="2"/>
-        </w:numPr>
-        <w:spacing w:after="60"/>
-      </w:pPr>
-      <w:r>
-        <w:t xml:space="preserve">The form: the photos and notes so far in a media pager on top, the trip and coordinates, then name (required, checked against the name rules), description (optional) and group (optional); at the bottom Add photo, </w:t>
+        <w:t>. Photos are taken one after the other, each shown as a thumbnail; Done (n) closes the camera. With no photo taken the button reads Skip; the Back gesture also closes the camera, keeping the photos. Tap the preview to focus and meter on that point (a ring shows where; back to continuous focus after 5 s); pinch to zoom.</w:t>
+      </w:r>
+    </w:p>
+    <w:p>
+      <w:pPr>
+        <w:pStyle w:val="ListParagraph"/>
+        <w:numPr>
+          <w:ilvl w:val="0"/>
+          <w:numId w:val="2"/>
+        </w:numPr>
+        <w:spacing w:after="60"/>
+      </w:pPr>
+      <w:r>
+        <w:t xml:space="preserve">The form: the photos and notes so far in a media pager on top, the trip and coordinates, then name (required, prefilled with the date and time the position was taken, DD.MM.YYYY HH-MM-SS, checked against the name rules), description (optional) and group (optional); at the bottom Add photo, </w:t>
       </w:r>
       <w:proofErr w:type="gramStart"/>
       <w:r>
@@ -3614,20 +3712,20 @@
         <w:spacing w:after="60"/>
       </w:pPr>
       <w:r>
-        <w:t>Rows: each trip with its color swatch; its recordings/ folder, each recording labelled by its date range (e.g. 2026-09-14 08:10 – 17:45), incomplete ones marked “incomplete”; and its POIs, each with its group icon (hover: date and group).</w:t>
-      </w:r>
-    </w:p>
-    <w:p>
-      <w:pPr>
-        <w:pStyle w:val="ListParagraph"/>
-        <w:numPr>
-          <w:ilvl w:val="0"/>
-          <w:numId w:val="2"/>
-        </w:numPr>
-        <w:spacing w:after="60"/>
-      </w:pPr>
-      <w:r>
-        <w:t>Checkable: a whole trip, a trip’s recordings/ folder, a single recording, or a POI. A POI is one unit; files inside it can’t be checked. A folder whose items are only partly ticked shows a partial tick.</w:t>
+        <w:t>Rows: each trip with its color swatch; its recordings/ folder, each recording labelled by its date range (e.g. 2026-09-14 08:10 – 17:45), incomplete ones marked “incomplete”; its general_recordings/ folder (only when it has files), collapsed, opened with its arrow, one row per file, newest first, each with a play button that opens an audio player under it (one player at a time; clicking again closes it); and its POIs, each with its group icon (hover: date and group).</w:t>
+      </w:r>
+    </w:p>
+    <w:p>
+      <w:pPr>
+        <w:pStyle w:val="ListParagraph"/>
+        <w:numPr>
+          <w:ilvl w:val="0"/>
+          <w:numId w:val="2"/>
+        </w:numPr>
+        <w:spacing w:after="60"/>
+      </w:pPr>
+      <w:r>
+        <w:t>Checkable: a whole trip, a trip’s recordings/ folder, a single recording, or a POI. general_recordings/ has no checkboxes (nothing of it is on the map). A POI is one unit; files inside it can’t be checked. A folder whose items are only partly ticked shows a partial tick.</w:t>
       </w:r>
     </w:p>
     <w:p>
@@ -10597,6 +10695,20 @@
       </w:pPr>
       <w:r>
         <w:t>A sync runs in a foreground service with a notification (“Syncing with Google Drive · 4 of 12”), so it carries on if the app goes to the background. The phone uses no data at all until Sync is pressed.</w:t>
+      </w:r>
+    </w:p>
+    <w:p>
+      <w:pPr>
+        <w:pStyle w:val="ListParagraph"/>
+        <w:numPr>
+          <w:ilvl w:val="0"/>
+          <w:numId w:val="2"/>
+        </w:numPr>
+        <w:spacing w:after="60"/>
+      </w:pPr>
+      <w:r>
+        <w:rPr/>
+        <w:t>Sync works on Wi-Fi only. Without Wi-Fi (on mobile data, roaming or not) the Sync button just toasts “Sync works on Wi-Fi only. Connect to Wi-Fi and try again.” The pass is bound to the Wi-Fi network, so if Wi-Fi drops it fails instead of moving to mobile data.</w:t>
       </w:r>
     </w:p>
     <w:p>

</xml_diff>

<commit_message>
Recordings: drawn at once as raw points, replaced by the cleaned line when its roads are in; cleaned lines cached on this PC (tracks-v1, keyed by the GPX's SHA-256, 30 days; incomplete recordings and raw fallbacks not cached), so a track is cleaned again only when its file changes
Co-Authored-By: Claude Opus 5.5 <noreply@anthropic.com>
</commit_message>
<xml_diff>
--- a/Trip_Explorer_Spec.docx
+++ b/Trip_Explorer_Spec.docx
@@ -9708,7 +9708,9 @@
         <w:spacing w:after="120"/>
       </w:pPr>
       <w:r>
-        <w:t>Runs in the PC app every time a recording is drawn (ticked in the folder tree, or after Refresh), on the whole file at once: read the GPX, fetch the roads for its area (cached after the first time), clean, draw. Nothing is saved; the change is cosmetic only. The files in the trips folder always stay the raw recordings.</w:t>
+        <w:t>Runs in the PC app when a recording is drawn (ticked in the folder tree, or after Refresh), on the whole file at once: read the GPX and draw its raw points at once (hover: “(raw, cleaning…)”), fetch the roads for its area (cached after the first time), clean, and replace the raw line with the cleaned one. The cleaned line is cached on this PC, in the app’s cache folder next to the roads (%LOCALAPPDATA%\com.lotanbar.tripexplorer\overpass</w:t>
+        <w:tab/>
+        <w:t>racks-v1, never in the trips folder), keyed by the SHA-256 of the GPX text, for 30 days: a recording is cleaned again only when its file changes (a rename keeps the entry). Incomplete recordings and raw fallbacks are not cached. The cache version is bumped whenever the cleanup changes. The files in the trips folder always stay the raw recordings.</w:t>
       </w:r>
     </w:p>
     <w:p>

</xml_diff>

<commit_message>
Spec: fix the track cache path
Co-Authored-By: Claude Opus 5.5 <noreply@anthropic.com>
</commit_message>
<xml_diff>
--- a/Trip_Explorer_Spec.docx
+++ b/Trip_Explorer_Spec.docx
@@ -9708,9 +9708,7 @@
         <w:spacing w:after="120"/>
       </w:pPr>
       <w:r>
-        <w:t>Runs in the PC app when a recording is drawn (ticked in the folder tree, or after Refresh), on the whole file at once: read the GPX and draw its raw points at once (hover: “(raw, cleaning…)”), fetch the roads for its area (cached after the first time), clean, and replace the raw line with the cleaned one. The cleaned line is cached on this PC, in the app’s cache folder next to the roads (%LOCALAPPDATA%\com.lotanbar.tripexplorer\overpass</w:t>
-        <w:tab/>
-        <w:t>racks-v1, never in the trips folder), keyed by the SHA-256 of the GPX text, for 30 days: a recording is cleaned again only when its file changes (a rename keeps the entry). Incomplete recordings and raw fallbacks are not cached. The cache version is bumped whenever the cleanup changes. The files in the trips folder always stay the raw recordings.</w:t>
+        <w:t>Runs in the PC app when a recording is drawn (ticked in the folder tree, or after Refresh), on the whole file at once: read the GPX and draw its raw points at once (hover: “(raw, cleaning…)”), fetch the roads for its area (cached after the first time), clean, and replace the raw line with the cleaned one. The cleaned line is cached on this PC, in the app’s cache folder next to the roads (%LOCALAPPDATA%\com.lotanbar.tripexplorer\overpass\tracks-v1, never in the trips folder), keyed by the SHA-256 of the GPX text, for 30 days: a recording is cleaned again only when its file changes (a rename keeps the entry). Incomplete recordings and raw fallbacks are not cached. The cache version is bumped whenever the cleanup changes. The files in the trips folder always stay the raw recordings.</w:t>
       </w:r>
     </w:p>
     <w:p>

</xml_diff>